<commit_message>
Minor folder structure changes + task_3_results.ipynb finished
</commit_message>
<xml_diff>
--- a/docs/Заренков.docx
+++ b/docs/Заренков.docx
@@ -30,12 +30,14 @@
       <w:r>
         <w:t xml:space="preserve">на базе данных </w:t>
       </w:r>
+      <w:proofErr w:type="spellStart"/>
       <w:r>
         <w:rPr>
           <w:lang w:val="en-US"/>
         </w:rPr>
         <w:t>AgPd</w:t>
       </w:r>
+      <w:proofErr w:type="spellEnd"/>
       <w:r>
         <w:t xml:space="preserve">. </w:t>
       </w:r>
@@ -62,12 +64,14 @@
       <w:r>
         <w:t xml:space="preserve"> Разобраться, какие оптимизаторы есть в </w:t>
       </w:r>
+      <w:proofErr w:type="spellStart"/>
       <w:r>
         <w:rPr>
           <w:lang w:val="en-US"/>
         </w:rPr>
         <w:t>scipy</w:t>
       </w:r>
+      <w:proofErr w:type="spellEnd"/>
       <w:r>
         <w:t xml:space="preserve"> (</w:t>
       </w:r>
@@ -82,6 +86,247 @@
       </w:r>
       <w:r>
         <w:t xml:space="preserve">). </w:t>
+      </w:r>
+    </w:p>
+    <w:p>
+      <w:r>
+        <w:t xml:space="preserve">3. Научиться в питон пробрасывать </w:t>
+      </w:r>
+      <w:proofErr w:type="spellStart"/>
+      <w:r>
+        <w:t>лосс</w:t>
+      </w:r>
+      <w:proofErr w:type="spellEnd"/>
+      <w:r>
+        <w:t xml:space="preserve"> и градиенты </w:t>
+      </w:r>
+      <w:proofErr w:type="spellStart"/>
+      <w:r>
+        <w:t>лосс</w:t>
+      </w:r>
+      <w:proofErr w:type="spellEnd"/>
+      <w:r>
+        <w:t xml:space="preserve"> функции для </w:t>
+      </w:r>
+      <w:r>
+        <w:rPr>
+          <w:lang w:val="en-US"/>
+        </w:rPr>
+        <w:t>MTP</w:t>
+      </w:r>
+      <w:r>
+        <w:t xml:space="preserve">. </w:t>
+      </w:r>
+      <w:r>
+        <w:t xml:space="preserve">Обучить </w:t>
+      </w:r>
+      <w:r>
+        <w:rPr>
+          <w:lang w:val="en-US"/>
+        </w:rPr>
+        <w:t>MTP</w:t>
+      </w:r>
+      <w:r>
+        <w:t xml:space="preserve"> </w:t>
+      </w:r>
+      <w:r>
+        <w:t xml:space="preserve">с помощью </w:t>
+      </w:r>
+      <w:proofErr w:type="spellStart"/>
+      <w:proofErr w:type="gramStart"/>
+      <w:r>
+        <w:rPr>
+          <w:lang w:val="en-US"/>
+        </w:rPr>
+        <w:t>scipy</w:t>
+      </w:r>
+      <w:proofErr w:type="spellEnd"/>
+      <w:r>
+        <w:t>.</w:t>
+      </w:r>
+      <w:proofErr w:type="spellStart"/>
+      <w:r>
+        <w:rPr>
+          <w:lang w:val="en-US"/>
+        </w:rPr>
+        <w:t>bfgs</w:t>
+      </w:r>
+      <w:proofErr w:type="spellEnd"/>
+      <w:proofErr w:type="gramEnd"/>
+      <w:r>
+        <w:t xml:space="preserve">, </w:t>
+      </w:r>
+      <w:r>
+        <w:t xml:space="preserve">сравнить результат с обычным </w:t>
+      </w:r>
+      <w:proofErr w:type="spellStart"/>
+      <w:r>
+        <w:rPr>
+          <w:lang w:val="en-US"/>
+        </w:rPr>
+        <w:t>bfgs</w:t>
+      </w:r>
+      <w:proofErr w:type="spellEnd"/>
+      <w:r>
+        <w:t>.</w:t>
+      </w:r>
+    </w:p>
+    <w:p>
+      <w:r>
+        <w:t xml:space="preserve">4. </w:t>
+      </w:r>
+      <w:r>
+        <w:t xml:space="preserve">Попробовать разные обучалки из </w:t>
+      </w:r>
+      <w:proofErr w:type="spellStart"/>
+      <w:r>
+        <w:rPr>
+          <w:lang w:val="en-US"/>
+        </w:rPr>
+        <w:t>scipy</w:t>
+      </w:r>
+      <w:proofErr w:type="spellEnd"/>
+      <w:r>
+        <w:t xml:space="preserve"> (либо написанные руками, если их нет в </w:t>
+      </w:r>
+      <w:proofErr w:type="spellStart"/>
+      <w:r>
+        <w:rPr>
+          <w:lang w:val="en-US"/>
+        </w:rPr>
+        <w:t>scipy</w:t>
+      </w:r>
+      <w:proofErr w:type="spellEnd"/>
+      <w:r>
+        <w:t xml:space="preserve">) </w:t>
+      </w:r>
+      <w:r>
+        <w:t xml:space="preserve">для обучения </w:t>
+      </w:r>
+      <w:r>
+        <w:rPr>
+          <w:lang w:val="en-US"/>
+        </w:rPr>
+        <w:t>MTP</w:t>
+      </w:r>
+      <w:r>
+        <w:t xml:space="preserve"> </w:t>
+      </w:r>
+      <w:r>
+        <w:t xml:space="preserve">и </w:t>
+      </w:r>
+      <w:r>
+        <w:rPr>
+          <w:lang w:val="en-US"/>
+        </w:rPr>
+        <w:t>ETN</w:t>
+      </w:r>
+      <w:r>
+        <w:t xml:space="preserve">. </w:t>
+      </w:r>
+      <w:r>
+        <w:t xml:space="preserve">Взять базы данных </w:t>
+      </w:r>
+      <w:proofErr w:type="spellStart"/>
+      <w:r>
+        <w:rPr>
+          <w:lang w:val="en-US"/>
+        </w:rPr>
+        <w:t>AgPd</w:t>
+      </w:r>
+      <w:proofErr w:type="spellEnd"/>
+      <w:r>
+        <w:t xml:space="preserve"> </w:t>
+      </w:r>
+      <w:r>
+        <w:t xml:space="preserve">и </w:t>
+      </w:r>
+      <w:proofErr w:type="spellStart"/>
+      <w:r>
+        <w:rPr>
+          <w:lang w:val="en-US"/>
+        </w:rPr>
+        <w:t>MoNbTaW</w:t>
+      </w:r>
+      <w:proofErr w:type="spellEnd"/>
+      <w:r>
+        <w:t xml:space="preserve"> (</w:t>
+      </w:r>
+      <w:r>
+        <w:t xml:space="preserve">там есть и обучающая, и </w:t>
+      </w:r>
+      <w:proofErr w:type="spellStart"/>
+      <w:r>
+        <w:t>валидационная</w:t>
+      </w:r>
+      <w:proofErr w:type="spellEnd"/>
+      <w:r>
+        <w:t xml:space="preserve"> выборки). Сравнивать ошибки валидации для разных потенциалов и оптимизаторов</w:t>
+      </w:r>
+      <w:r>
+        <w:t>, а также проценты хорошо обученных потенциалов (или, разброс ошибок обучения).</w:t>
+      </w:r>
+      <w:r>
+        <w:t xml:space="preserve">  + </w:t>
+      </w:r>
+      <w:hyperlink r:id="rId5" w:history="1">
+        <w:proofErr w:type="spellStart"/>
+        <w:r>
+          <w:rPr>
+            <w:rStyle w:val="ac"/>
+            <w:lang w:val="en-US"/>
+          </w:rPr>
+          <w:t>MuoN</w:t>
+        </w:r>
+        <w:proofErr w:type="spellEnd"/>
+      </w:hyperlink>
+      <w:r>
+        <w:rPr>
+          <w:lang w:val="en-US"/>
+        </w:rPr>
+        <w:t xml:space="preserve"> </w:t>
+      </w:r>
+      <w:r>
+        <w:t>оптимизатор</w:t>
+      </w:r>
+    </w:p>
+    <w:p>
+      <w:r>
+        <w:t xml:space="preserve">5. Для обучения </w:t>
+      </w:r>
+      <w:r>
+        <w:rPr>
+          <w:lang w:val="en-US"/>
+        </w:rPr>
+        <w:t>ETN</w:t>
+      </w:r>
+      <w:r>
+        <w:t xml:space="preserve"> </w:t>
+      </w:r>
+      <w:r>
+        <w:t>добавить возмущение параметров (возможно, тут свои оптимизаторы надо писать)</w:t>
+      </w:r>
+      <w:r>
+        <w:t xml:space="preserve"> и посмотреть, помогает ли возмущение параметров при обучении более стабильно обучать потенциалы. Успешность обучения проводить по тем же метрикам, что и в пункте 4.</w:t>
+      </w:r>
+    </w:p>
+    <w:p>
+      <w:r>
+        <w:t xml:space="preserve">6*. Те же тесты провести для </w:t>
+      </w:r>
+      <w:proofErr w:type="spellStart"/>
+      <w:r>
+        <w:rPr>
+          <w:lang w:val="en-US"/>
+        </w:rPr>
+        <w:t>DeePMD</w:t>
+      </w:r>
+      <w:proofErr w:type="spellEnd"/>
+      <w:r>
+        <w:t xml:space="preserve"> </w:t>
+      </w:r>
+      <w:r>
+        <w:t>и сравнить результаты.</w:t>
       </w:r>
     </w:p>
     <w:p>
@@ -91,146 +336,111 @@
         </w:rPr>
       </w:pPr>
       <w:r>
-        <w:t xml:space="preserve">3. Научиться в питон пробрасывать лосс и градиенты лосс функции для </w:t>
-      </w:r>
-      <w:r>
-        <w:rPr>
-          <w:lang w:val="en-US"/>
-        </w:rPr>
-        <w:t>MTP</w:t>
-      </w:r>
-      <w:r>
-        <w:t xml:space="preserve">. </w:t>
-      </w:r>
-      <w:r>
-        <w:t xml:space="preserve">Обучить </w:t>
-      </w:r>
-      <w:r>
-        <w:rPr>
-          <w:lang w:val="en-US"/>
-        </w:rPr>
-        <w:t>MTP</w:t>
-      </w:r>
-      <w:r>
-        <w:t xml:space="preserve"> </w:t>
-      </w:r>
-      <w:r>
-        <w:t xml:space="preserve">с помощью </w:t>
-      </w:r>
-      <w:r>
-        <w:rPr>
-          <w:lang w:val="en-US"/>
-        </w:rPr>
-        <w:t>scipy</w:t>
-      </w:r>
-      <w:r>
-        <w:t>.</w:t>
-      </w:r>
-      <w:r>
-        <w:rPr>
-          <w:lang w:val="en-US"/>
-        </w:rPr>
-        <w:t>bfgs</w:t>
-      </w:r>
-      <w:r>
-        <w:t xml:space="preserve">, </w:t>
-      </w:r>
-      <w:r>
-        <w:t xml:space="preserve">сравнить результат с обычным </w:t>
-      </w:r>
-      <w:r>
-        <w:rPr>
-          <w:lang w:val="en-US"/>
-        </w:rPr>
-        <w:t>bfgs</w:t>
-      </w:r>
-      <w:r>
-        <w:t>.</w:t>
+        <w:rPr>
+          <w:lang w:val="en-US"/>
+        </w:rPr>
+        <w:t>Shortlist:</w:t>
       </w:r>
     </w:p>
     <w:p>
-      <w:r>
-        <w:t xml:space="preserve">4. </w:t>
-      </w:r>
-      <w:r>
-        <w:t xml:space="preserve">Попробовать разные обучалки из </w:t>
-      </w:r>
+      <w:pPr>
+        <w:rPr>
+          <w:lang w:val="en-US"/>
+        </w:rPr>
+      </w:pPr>
+      <w:r>
+        <w:t xml:space="preserve">1 </w:t>
+      </w:r>
+      <w:r>
+        <w:rPr>
+          <w:lang w:val="en-US"/>
+        </w:rPr>
+        <w:t>Tunning</w:t>
+      </w:r>
+      <w:r>
+        <w:t xml:space="preserve"> </w:t>
+      </w:r>
+      <w:proofErr w:type="spellStart"/>
+      <w:proofErr w:type="gramStart"/>
       <w:r>
         <w:rPr>
           <w:lang w:val="en-US"/>
         </w:rPr>
         <w:t>scipy</w:t>
       </w:r>
-      <w:r>
-        <w:t xml:space="preserve"> (либо написанные руками, если их нет в </w:t>
-      </w:r>
-      <w:r>
-        <w:rPr>
-          <w:lang w:val="en-US"/>
-        </w:rPr>
-        <w:t>scipy</w:t>
-      </w:r>
-      <w:r>
-        <w:t xml:space="preserve">) </w:t>
-      </w:r>
-      <w:r>
-        <w:t xml:space="preserve">для обучения </w:t>
-      </w:r>
-      <w:r>
-        <w:rPr>
-          <w:lang w:val="en-US"/>
-        </w:rPr>
-        <w:t>MTP</w:t>
-      </w:r>
+      <w:proofErr w:type="spellEnd"/>
+      <w:r>
+        <w:t>.</w:t>
+      </w:r>
+      <w:proofErr w:type="spellStart"/>
+      <w:r>
+        <w:rPr>
+          <w:lang w:val="en-US"/>
+        </w:rPr>
+        <w:t>bfgs</w:t>
+      </w:r>
+      <w:proofErr w:type="spellEnd"/>
+      <w:proofErr w:type="gramEnd"/>
       <w:r>
         <w:t xml:space="preserve"> </w:t>
       </w:r>
-      <w:r>
-        <w:t xml:space="preserve">и </w:t>
-      </w:r>
-      <w:r>
-        <w:rPr>
-          <w:lang w:val="en-US"/>
-        </w:rPr>
-        <w:t>ETN</w:t>
-      </w:r>
-      <w:r>
-        <w:t xml:space="preserve">. </w:t>
-      </w:r>
-      <w:r>
-        <w:t xml:space="preserve">Взять базы данных </w:t>
-      </w:r>
-      <w:r>
-        <w:rPr>
-          <w:lang w:val="en-US"/>
-        </w:rPr>
-        <w:t>AgPd</w:t>
-      </w:r>
+      <w:proofErr w:type="spellStart"/>
+      <w:r>
+        <w:t>подбрать</w:t>
+      </w:r>
+      <w:proofErr w:type="spellEnd"/>
       <w:r>
         <w:t xml:space="preserve"> </w:t>
       </w:r>
       <w:r>
-        <w:t xml:space="preserve">и </w:t>
-      </w:r>
-      <w:r>
-        <w:rPr>
-          <w:lang w:val="en-US"/>
-        </w:rPr>
-        <w:t>MoNbTaW</w:t>
-      </w:r>
-      <w:r>
-        <w:t xml:space="preserve"> (</w:t>
-      </w:r>
-      <w:r>
-        <w:t>там есть и обучающая, и валидационная выборки). Сравнивать ошибки валидации для разных потенциалов и оптимизаторов</w:t>
-      </w:r>
-      <w:r>
-        <w:t>, а также проценты хорошо обученных потенциалов (или, разброс ошибок обучения).</w:t>
+        <w:t>лучший</w:t>
+      </w:r>
+      <w:r>
+        <w:t xml:space="preserve"> </w:t>
+      </w:r>
+      <w:proofErr w:type="spellStart"/>
+      <w:r>
+        <w:t>интвервал</w:t>
+      </w:r>
+      <w:proofErr w:type="spellEnd"/>
+      <w:r>
+        <w:t xml:space="preserve"> </w:t>
+      </w:r>
+      <w:r>
+        <w:t xml:space="preserve">+ </w:t>
+      </w:r>
+      <w:proofErr w:type="gramStart"/>
+      <w:r>
+        <w:t>убедится</w:t>
+      </w:r>
+      <w:proofErr w:type="gramEnd"/>
+      <w:r>
+        <w:t xml:space="preserve"> что для </w:t>
+      </w:r>
+      <w:proofErr w:type="spellStart"/>
+      <w:r>
+        <w:rPr>
+          <w:lang w:val="en-US"/>
+        </w:rPr>
+        <w:t>mtp</w:t>
+      </w:r>
+      <w:proofErr w:type="spellEnd"/>
+      <w:r>
+        <w:t xml:space="preserve"> </w:t>
+      </w:r>
+      <w:r>
+        <w:t xml:space="preserve">лучший </w:t>
+      </w:r>
+      <w:r>
+        <w:t>[-1, 1]</w:t>
       </w:r>
     </w:p>
     <w:p>
       <w:r>
-        <w:t xml:space="preserve">5. Для обучения </w:t>
+        <w:t xml:space="preserve">2 </w:t>
+      </w:r>
+      <w:r>
+        <w:t xml:space="preserve">Разобраться с </w:t>
       </w:r>
       <w:r>
         <w:rPr>
@@ -239,32 +449,27 @@
         <w:t>ETN</w:t>
       </w:r>
       <w:r>
-        <w:t xml:space="preserve"> </w:t>
-      </w:r>
-      <w:r>
-        <w:t>добавить возмущение параметров (возможно, тут свои оптимизаторы надо писать)</w:t>
-      </w:r>
-      <w:r>
-        <w:t xml:space="preserve"> и посмотреть, помогает ли возмущение параметров при обучении более стабильно обучать потенциалы. Успешность обучения проводить по тем же метрикам, что и в пункте 4.</w:t>
+        <w:t xml:space="preserve"> – почему на ансамбле идентичные результаты </w:t>
       </w:r>
     </w:p>
     <w:p>
-      <w:r>
-        <w:t xml:space="preserve">6*. Те же тесты провести для </w:t>
-      </w:r>
-      <w:r>
-        <w:rPr>
-          <w:lang w:val="en-US"/>
-        </w:rPr>
-        <w:t>DeePMD</w:t>
-      </w:r>
-      <w:r>
-        <w:t xml:space="preserve"> </w:t>
-      </w:r>
-      <w:r>
-        <w:t>и сравнить результаты.</w:t>
+      <w:pPr>
+        <w:rPr>
+          <w:lang w:val="en-US"/>
+        </w:rPr>
+      </w:pPr>
+      <w:r>
+        <w:t xml:space="preserve">3 Переходить к следующим методам. Не забыть </w:t>
+      </w:r>
+      <w:r>
+        <w:rPr>
+          <w:lang w:val="en-US"/>
+        </w:rPr>
+        <w:t>MuOn</w:t>
       </w:r>
     </w:p>
+    <w:p/>
+    <w:p/>
     <w:sectPr>
       <w:pgSz w:w="11906" w:h="16838"/>
       <w:pgMar w:top="1134" w:right="850" w:bottom="1134" w:left="1701" w:header="708" w:footer="708" w:gutter="0"/>
@@ -1192,6 +1397,29 @@
       <w:spacing w:val="5"/>
     </w:rPr>
   </w:style>
+  <w:style w:type="character" w:styleId="ac">
+    <w:name w:val="Hyperlink"/>
+    <w:basedOn w:val="a0"/>
+    <w:uiPriority w:val="99"/>
+    <w:unhideWhenUsed/>
+    <w:rsid w:val="0001319C"/>
+    <w:rPr>
+      <w:color w:val="0563C1" w:themeColor="hyperlink"/>
+      <w:u w:val="single"/>
+    </w:rPr>
+  </w:style>
+  <w:style w:type="character" w:styleId="ad">
+    <w:name w:val="Unresolved Mention"/>
+    <w:basedOn w:val="a0"/>
+    <w:uiPriority w:val="99"/>
+    <w:semiHidden/>
+    <w:unhideWhenUsed/>
+    <w:rsid w:val="0001319C"/>
+    <w:rPr>
+      <w:color w:val="605E5C"/>
+      <w:shd w:val="clear" w:color="auto" w:fill="E1DFDD"/>
+    </w:rPr>
+  </w:style>
 </w:styles>
 </file>
 
@@ -1488,4 +1716,16 @@
     </a:ext>
   </a:extLst>
 </a:theme>
+</file>
+
+<file path=customXml/item1.xml><?xml version="1.0" encoding="utf-8"?>
+<b:Sources xmlns:b="http://schemas.openxmlformats.org/officeDocument/2006/bibliography" xmlns="http://schemas.openxmlformats.org/officeDocument/2006/bibliography" SelectedStyle="/APASixthEditionOfficeOnline.xsl" StyleName="APA" Version="6"/>
+</file>
+
+<file path=customXml/itemProps1.xml><?xml version="1.0" encoding="utf-8"?>
+<ds:datastoreItem xmlns:ds="http://schemas.openxmlformats.org/officeDocument/2006/customXml" ds:itemID="{26F2786F-83FE-CB43-B569-D05BE140E47E}">
+  <ds:schemaRefs>
+    <ds:schemaRef ds:uri="http://schemas.openxmlformats.org/officeDocument/2006/bibliography"/>
+  </ds:schemaRefs>
+</ds:datastoreItem>
 </file>
</xml_diff>

<commit_message>
all results before presentation of the project
</commit_message>
<xml_diff>
--- a/docs/Заренков.docx
+++ b/docs/Заренков.docx
@@ -269,7 +269,7 @@
       <w:r>
         <w:t xml:space="preserve">  + </w:t>
       </w:r>
-      <w:hyperlink r:id="rId5" w:history="1">
+      <w:hyperlink r:id="rId6" w:history="1">
         <w:proofErr w:type="spellStart"/>
         <w:r>
           <w:rPr>
@@ -281,9 +281,6 @@
         <w:proofErr w:type="spellEnd"/>
       </w:hyperlink>
       <w:r>
-        <w:rPr>
-          <w:lang w:val="en-US"/>
-        </w:rPr>
         <w:t xml:space="preserve"> </w:t>
       </w:r>
       <w:r>
@@ -339,7 +336,13 @@
         <w:rPr>
           <w:lang w:val="en-US"/>
         </w:rPr>
-        <w:t>Shortlist:</w:t>
+        <w:t>Shortlist</w:t>
+      </w:r>
+      <w:r>
+        <w:rPr>
+          <w:lang w:val="en-US"/>
+        </w:rPr>
+        <w:t>:</w:t>
       </w:r>
     </w:p>
     <w:p>
@@ -349,127 +352,224 @@
         </w:rPr>
       </w:pPr>
       <w:r>
+        <w:rPr>
+          <w:lang w:val="en-US"/>
+        </w:rPr>
         <w:t xml:space="preserve">1 </w:t>
       </w:r>
       <w:r>
-        <w:rPr>
-          <w:lang w:val="en-US"/>
-        </w:rPr>
-        <w:t>Tunning</w:t>
-      </w:r>
-      <w:r>
+        <w:t>Обучить</w:t>
+      </w:r>
+      <w:r>
+        <w:rPr>
+          <w:lang w:val="en-US"/>
+        </w:rPr>
         <w:t xml:space="preserve"> </w:t>
       </w:r>
       <w:proofErr w:type="spellStart"/>
-      <w:proofErr w:type="gramStart"/>
-      <w:r>
-        <w:rPr>
-          <w:lang w:val="en-US"/>
-        </w:rPr>
-        <w:t>scipy</w:t>
-      </w:r>
-      <w:proofErr w:type="spellEnd"/>
-      <w:r>
-        <w:t>.</w:t>
-      </w:r>
-      <w:proofErr w:type="spellStart"/>
-      <w:r>
-        <w:rPr>
-          <w:lang w:val="en-US"/>
-        </w:rPr>
-        <w:t>bfgs</w:t>
-      </w:r>
-      <w:proofErr w:type="spellEnd"/>
-      <w:proofErr w:type="gramEnd"/>
-      <w:r>
+      <w:r>
+        <w:rPr>
+          <w:lang w:val="en-US"/>
+        </w:rPr>
+        <w:t>etn</w:t>
+      </w:r>
+      <w:proofErr w:type="spellEnd"/>
+      <w:r>
+        <w:rPr>
+          <w:lang w:val="en-US"/>
+        </w:rPr>
         <w:t xml:space="preserve"> </w:t>
       </w:r>
-      <w:proofErr w:type="spellStart"/>
-      <w:r>
-        <w:t>подбрать</w:t>
-      </w:r>
-      <w:proofErr w:type="spellEnd"/>
-      <w:r>
+      <w:r>
+        <w:t>на</w:t>
+      </w:r>
+      <w:r>
+        <w:rPr>
+          <w:lang w:val="en-US"/>
+        </w:rPr>
         <w:t xml:space="preserve"> </w:t>
       </w:r>
-      <w:r>
-        <w:t>лучший</w:t>
-      </w:r>
-      <w:r>
+      <w:proofErr w:type="spellStart"/>
+      <w:r>
+        <w:rPr>
+          <w:lang w:val="en-US"/>
+        </w:rPr>
+        <w:t>sgd</w:t>
+      </w:r>
+      <w:proofErr w:type="spellEnd"/>
+      <w:r>
+        <w:rPr>
+          <w:lang w:val="en-US"/>
+        </w:rPr>
         <w:t xml:space="preserve"> </w:t>
       </w:r>
-      <w:proofErr w:type="spellStart"/>
-      <w:r>
-        <w:t>интвервал</w:t>
-      </w:r>
-      <w:proofErr w:type="spellEnd"/>
-      <w:r>
+      <w:r>
+        <w:rPr>
+          <w:lang w:val="en-US"/>
+        </w:rPr>
+        <w:t>momentum</w:t>
+      </w:r>
+      <w:r>
+        <w:rPr>
+          <w:lang w:val="en-US"/>
+        </w:rPr>
         <w:t xml:space="preserve"> </w:t>
       </w:r>
       <w:r>
-        <w:t xml:space="preserve">+ </w:t>
-      </w:r>
-      <w:proofErr w:type="gramStart"/>
-      <w:r>
-        <w:t>убедится</w:t>
-      </w:r>
-      <w:proofErr w:type="gramEnd"/>
-      <w:r>
-        <w:t xml:space="preserve"> что для </w:t>
-      </w:r>
-      <w:proofErr w:type="spellStart"/>
-      <w:r>
-        <w:rPr>
-          <w:lang w:val="en-US"/>
-        </w:rPr>
-        <w:t>mtp</w:t>
-      </w:r>
-      <w:proofErr w:type="spellEnd"/>
-      <w:r>
+        <w:t>и</w:t>
+      </w:r>
+      <w:r>
+        <w:rPr>
+          <w:lang w:val="en-US"/>
+        </w:rPr>
         <w:t xml:space="preserve"> </w:t>
       </w:r>
-      <w:r>
-        <w:t xml:space="preserve">лучший </w:t>
-      </w:r>
-      <w:r>
-        <w:t>[-1, 1]</w:t>
-      </w:r>
+      <w:proofErr w:type="spellStart"/>
+      <w:r>
+        <w:rPr>
+          <w:lang w:val="en-US"/>
+        </w:rPr>
+        <w:t>adam</w:t>
+      </w:r>
+      <w:proofErr w:type="spellEnd"/>
     </w:p>
     <w:p>
       <w:r>
         <w:t xml:space="preserve">2 </w:t>
       </w:r>
       <w:r>
-        <w:t xml:space="preserve">Разобраться с </w:t>
-      </w:r>
-      <w:r>
-        <w:rPr>
-          <w:lang w:val="en-US"/>
-        </w:rPr>
-        <w:t>ETN</w:t>
-      </w:r>
-      <w:r>
-        <w:t xml:space="preserve"> – почему на ансамбле идентичные результаты </w:t>
+        <w:t xml:space="preserve">Повозиться с </w:t>
+      </w:r>
+      <w:proofErr w:type="spellStart"/>
+      <w:r>
+        <w:t>клиппингом</w:t>
+      </w:r>
+      <w:proofErr w:type="spellEnd"/>
+      <w:r>
+        <w:t xml:space="preserve"> </w:t>
+      </w:r>
+      <w:proofErr w:type="spellStart"/>
+      <w:r>
+        <w:rPr>
+          <w:lang w:val="en-US"/>
+        </w:rPr>
+        <w:t>lr</w:t>
+      </w:r>
+      <w:proofErr w:type="spellEnd"/>
+      <w:r>
+        <w:t xml:space="preserve"> </w:t>
+      </w:r>
+      <w:r>
+        <w:t xml:space="preserve">и дообучением на </w:t>
+      </w:r>
+      <w:proofErr w:type="spellStart"/>
+      <w:r>
+        <w:rPr>
+          <w:lang w:val="en-US"/>
+        </w:rPr>
+        <w:t>lbfgs</w:t>
+      </w:r>
+      <w:proofErr w:type="spellEnd"/>
+      <w:r>
+        <w:t xml:space="preserve"> </w:t>
+      </w:r>
+      <w:r>
+        <w:t xml:space="preserve">для адама </w:t>
+      </w:r>
+    </w:p>
+    <w:p>
+      <w:r>
+        <w:t>3</w:t>
+      </w:r>
+      <w:r>
+        <w:t xml:space="preserve"> Переходить к следующим методам. Не забыть </w:t>
+      </w:r>
+      <w:proofErr w:type="spellStart"/>
+      <w:r>
+        <w:rPr>
+          <w:lang w:val="en-US"/>
+        </w:rPr>
+        <w:t>MuOn</w:t>
+      </w:r>
+      <w:proofErr w:type="spellEnd"/>
+    </w:p>
+    <w:p>
+      <w:r>
+        <w:t>4 Применить методы на другом датасете</w:t>
+      </w:r>
+    </w:p>
+    <w:p/>
+    <w:p>
+      <w:pPr>
+        <w:rPr>
+          <w:lang w:val="en-US"/>
+        </w:rPr>
+      </w:pPr>
+      <w:r>
+        <w:t>Проблема</w:t>
+      </w:r>
+      <w:r>
+        <w:t xml:space="preserve">: </w:t>
+      </w:r>
+      <w:r>
+        <w:t xml:space="preserve">разбивать на </w:t>
+      </w:r>
+      <w:proofErr w:type="spellStart"/>
+      <w:r>
+        <w:t>батчи</w:t>
+      </w:r>
+      <w:proofErr w:type="spellEnd"/>
+      <w:r>
+        <w:t xml:space="preserve"> при разном числе атомов</w:t>
+      </w:r>
+      <w:r>
+        <w:br/>
+      </w:r>
+      <w:r>
+        <w:br/>
+      </w:r>
+      <w:r>
+        <w:br/>
+      </w:r>
+      <w:r>
+        <w:rPr>
+          <w:lang w:val="en-US"/>
+        </w:rPr>
+        <w:t>new</w:t>
+      </w:r>
+      <w:r>
+        <w:t xml:space="preserve"> </w:t>
+      </w:r>
+      <w:r>
+        <w:rPr>
+          <w:lang w:val="en-US"/>
+        </w:rPr>
+        <w:t>shortlist</w:t>
+      </w:r>
+      <w:r>
+        <w:t>:</w:t>
       </w:r>
     </w:p>
     <w:p>
       <w:pPr>
-        <w:rPr>
-          <w:lang w:val="en-US"/>
-        </w:rPr>
+        <w:pStyle w:val="a7"/>
+        <w:numPr>
+          <w:ilvl w:val="0"/>
+          <w:numId w:val="1"/>
+        </w:numPr>
       </w:pPr>
       <w:r>
-        <w:t xml:space="preserve">3 Переходить к следующим методам. Не забыть </w:t>
-      </w:r>
-      <w:r>
-        <w:rPr>
-          <w:lang w:val="en-US"/>
-        </w:rPr>
-        <w:t>MuOn</w:t>
+        <w:t xml:space="preserve"> </w:t>
+      </w:r>
+      <w:r>
+        <w:t>Запустить для всех методов 5 компонентный датасет</w:t>
       </w:r>
     </w:p>
-    <w:p/>
-    <w:p/>
+    <w:p>
+      <w:pPr>
+        <w:pStyle w:val="a7"/>
+      </w:pPr>
+    </w:p>
     <w:sectPr>
       <w:pgSz w:w="11906" w:h="16838"/>
       <w:pgMar w:top="1134" w:right="850" w:bottom="1134" w:left="1701" w:header="708" w:footer="708" w:gutter="0"/>
@@ -478,6 +578,100 @@
     </w:sectPr>
   </w:body>
 </w:document>
+</file>
+
+<file path=word/numbering.xml><?xml version="1.0" encoding="utf-8"?>
+<w:numbering xmlns:wpc="http://schemas.microsoft.com/office/word/2010/wordprocessingCanvas" xmlns:cx="http://schemas.microsoft.com/office/drawing/2014/chartex" xmlns:cx1="http://schemas.microsoft.com/office/drawing/2015/9/8/chartex" xmlns:cx2="http://schemas.microsoft.com/office/drawing/2015/10/21/chartex" xmlns:cx3="http://schemas.microsoft.com/office/drawing/2016/5/9/chartex" xmlns:cx4="http://schemas.microsoft.com/office/drawing/2016/5/10/chartex" xmlns:cx5="http://schemas.microsoft.com/office/drawing/2016/5/11/chartex" xmlns:cx6="http://schemas.microsoft.com/office/drawing/2016/5/12/chartex" xmlns:cx7="http://schemas.microsoft.com/office/drawing/2016/5/13/chartex" xmlns:cx8="http://schemas.microsoft.com/office/drawing/2016/5/14/chartex" xmlns:mc="http://schemas.openxmlformats.org/markup-compatibility/2006" xmlns:aink="http://schemas.microsoft.com/office/drawing/2016/ink" xmlns:am3d="http://schemas.microsoft.com/office/drawing/2017/model3d" xmlns:o="urn:schemas-microsoft-com:office:office" xmlns:oel="http://schemas.microsoft.com/office/2019/extlst" xmlns:r="http://schemas.openxmlformats.org/officeDocument/2006/relationships" xmlns:m="http://schemas.openxmlformats.org/officeDocument/2006/math" xmlns:v="urn:schemas-microsoft-com:vml" xmlns:wp14="http://schemas.microsoft.com/office/word/2010/wordprocessingDrawing" xmlns:wp="http://schemas.openxmlformats.org/drawingml/2006/wordprocessingDrawing" xmlns:w10="urn:schemas-microsoft-com:office:word" xmlns:w="http://schemas.openxmlformats.org/wordprocessingml/2006/main" xmlns:w14="http://schemas.microsoft.com/office/word/2010/wordml" xmlns:w15="http://schemas.microsoft.com/office/word/2012/wordml" xmlns:w16cex="http://schemas.microsoft.com/office/word/2018/wordml/cex" xmlns:w16cid="http://schemas.microsoft.com/office/word/2016/wordml/cid" xmlns:w16="http://schemas.microsoft.com/office/word/2018/wordml" xmlns:w16du="http://schemas.microsoft.com/office/word/2023/wordml/word16du" xmlns:w16sdtdh="http://schemas.microsoft.com/office/word/2020/wordml/sdtdatahash" xmlns:w16sdtfl="http://schemas.microsoft.com/office/word/2024/wordml/sdtformatlock" xmlns:w16se="http://schemas.microsoft.com/office/word/2015/wordml/symex" xmlns:wpg="http://schemas.microsoft.com/office/word/2010/wordprocessingGroup" xmlns:wpi="http://schemas.microsoft.com/office/word/2010/wordprocessingInk" xmlns:wne="http://schemas.microsoft.com/office/word/2006/wordml" xmlns:wps="http://schemas.microsoft.com/office/word/2010/wordprocessingShape" mc:Ignorable="w14 w15 w16se w16cid w16 w16cex w16sdtdh w16sdtfl w16du wp14">
+  <w:abstractNum w:abstractNumId="0" w15:restartNumberingAfterBreak="0">
+    <w:nsid w:val="611F2317"/>
+    <w:multiLevelType w:val="hybridMultilevel"/>
+    <w:tmpl w:val="AB960796"/>
+    <w:lvl w:ilvl="0" w:tplc="0419000F">
+      <w:start w:val="1"/>
+      <w:numFmt w:val="decimal"/>
+      <w:lvlText w:val="%1."/>
+      <w:lvlJc w:val="left"/>
+      <w:pPr>
+        <w:ind w:left="720" w:hanging="360"/>
+      </w:pPr>
+    </w:lvl>
+    <w:lvl w:ilvl="1" w:tplc="04190019" w:tentative="1">
+      <w:start w:val="1"/>
+      <w:numFmt w:val="lowerLetter"/>
+      <w:lvlText w:val="%2."/>
+      <w:lvlJc w:val="left"/>
+      <w:pPr>
+        <w:ind w:left="1440" w:hanging="360"/>
+      </w:pPr>
+    </w:lvl>
+    <w:lvl w:ilvl="2" w:tplc="0419001B" w:tentative="1">
+      <w:start w:val="1"/>
+      <w:numFmt w:val="lowerRoman"/>
+      <w:lvlText w:val="%3."/>
+      <w:lvlJc w:val="right"/>
+      <w:pPr>
+        <w:ind w:left="2160" w:hanging="180"/>
+      </w:pPr>
+    </w:lvl>
+    <w:lvl w:ilvl="3" w:tplc="0419000F" w:tentative="1">
+      <w:start w:val="1"/>
+      <w:numFmt w:val="decimal"/>
+      <w:lvlText w:val="%4."/>
+      <w:lvlJc w:val="left"/>
+      <w:pPr>
+        <w:ind w:left="2880" w:hanging="360"/>
+      </w:pPr>
+    </w:lvl>
+    <w:lvl w:ilvl="4" w:tplc="04190019" w:tentative="1">
+      <w:start w:val="1"/>
+      <w:numFmt w:val="lowerLetter"/>
+      <w:lvlText w:val="%5."/>
+      <w:lvlJc w:val="left"/>
+      <w:pPr>
+        <w:ind w:left="3600" w:hanging="360"/>
+      </w:pPr>
+    </w:lvl>
+    <w:lvl w:ilvl="5" w:tplc="0419001B" w:tentative="1">
+      <w:start w:val="1"/>
+      <w:numFmt w:val="lowerRoman"/>
+      <w:lvlText w:val="%6."/>
+      <w:lvlJc w:val="right"/>
+      <w:pPr>
+        <w:ind w:left="4320" w:hanging="180"/>
+      </w:pPr>
+    </w:lvl>
+    <w:lvl w:ilvl="6" w:tplc="0419000F" w:tentative="1">
+      <w:start w:val="1"/>
+      <w:numFmt w:val="decimal"/>
+      <w:lvlText w:val="%7."/>
+      <w:lvlJc w:val="left"/>
+      <w:pPr>
+        <w:ind w:left="5040" w:hanging="360"/>
+      </w:pPr>
+    </w:lvl>
+    <w:lvl w:ilvl="7" w:tplc="04190019" w:tentative="1">
+      <w:start w:val="1"/>
+      <w:numFmt w:val="lowerLetter"/>
+      <w:lvlText w:val="%8."/>
+      <w:lvlJc w:val="left"/>
+      <w:pPr>
+        <w:ind w:left="5760" w:hanging="360"/>
+      </w:pPr>
+    </w:lvl>
+    <w:lvl w:ilvl="8" w:tplc="0419001B" w:tentative="1">
+      <w:start w:val="1"/>
+      <w:numFmt w:val="lowerRoman"/>
+      <w:lvlText w:val="%9."/>
+      <w:lvlJc w:val="right"/>
+      <w:pPr>
+        <w:ind w:left="6480" w:hanging="180"/>
+      </w:pPr>
+    </w:lvl>
+  </w:abstractNum>
+  <w:num w:numId="1" w16cid:durableId="1525095617">
+    <w:abstractNumId w:val="0"/>
+  </w:num>
+</w:numbering>
 </file>
 
 <file path=word/styles.xml><?xml version="1.0" encoding="utf-8"?>

</xml_diff>